<commit_message>
start of data vis workshop
</commit_message>
<xml_diff>
--- a/Workshops/sbstemplate.docx
+++ b/Workshops/sbstemplate.docx
@@ -2042,13 +2042,14 @@
     <w:uiPriority w:val="9"/>
     <w:unhideWhenUsed/>
     <w:qFormat/>
-    <w:rsid w:val="00F34E30"/>
+    <w:rsid w:val="002C0470"/>
     <w:pPr>
       <w:spacing w:before="100" w:after="100"/>
       <w:ind w:left="480" w:right="480"/>
     </w:pPr>
     <w:rPr>
-      <w:rFonts w:ascii="Avenir Next LT Pro" w:hAnsi="Avenir Next LT Pro"/>
+      <w:rFonts w:ascii="Aptos" w:hAnsi="Aptos"/>
+      <w:color w:val="1D1B11" w:themeColor="background2" w:themeShade="1A"/>
     </w:rPr>
   </w:style>
   <w:style w:type="paragraph" w:styleId="FootnoteText">

</xml_diff>